<commit_message>
docs: update manual book v2.1 Enterprise dengan studi kasus penguncian hari/kelas persisten dan Bab Pusat Bentrok
</commit_message>
<xml_diff>
--- a/MANUAL_BOOK_SIP_MAPEL_v2.1_ENTERPRISE.docx
+++ b/MANUAL_BOOK_SIP_MAPEL_v2.1_ENTERPRISE.docx
@@ -271,7 +271,7 @@
               <w:rPr>
                 <w:sz w:val="19"/>
               </w:rPr>
-              <w:t>Navigasi antarmuka portal terpadu ala portal publik BPJS.</w:t>
+              <w:t>Navigasi antarmuka portal terpadu Broadsheet &amp; Identitas Yayasan Annida Al Islamy.</w:t>
             </w:r>
           </w:p>
         </w:tc>
@@ -353,7 +353,7 @@
               <w:rPr>
                 <w:sz w:val="19"/>
               </w:rPr>
-              <w:t>Konfigurasi Teacher Constraints (kalender hari/jam libur guru).</w:t>
+              <w:t>Konfigurasi Teacher Constraints &amp; Studi Kasus Penguncian Hari/Kelas Persisten.</w:t>
             </w:r>
           </w:p>
         </w:tc>
@@ -558,7 +558,7 @@
               <w:rPr>
                 <w:sz w:val="19"/>
               </w:rPr>
-              <w:t>Pencatatan rekam jejak mutasi jadwal dan aktvitas auto-generator.</w:t>
+              <w:t>Pencatatan rekam jejak mutasi jadwal dan aktivitas auto-generator.</w:t>
             </w:r>
           </w:p>
         </w:tc>
@@ -580,7 +580,48 @@
                 <w:b/>
                 <w:sz w:val="19"/>
               </w:rPr>
-              <w:t>BAB 11: PANDUAN TEKNIS &amp; TROUBLESHOOTING ADMINISTRATOR</w:t>
+              <w:t>BAB 11: PUSAT DETEKSI BENTROK (CONFLICT CENTER)</w:t>
+            </w:r>
+          </w:p>
+        </w:tc>
+        <w:tc>
+          <w:tcPr>
+            <w:tcW w:type="dxa" w:w="4680"/>
+            <w:tcMar>
+              <w:top w:w="80" w:type="dxa"/>
+              <w:bottom w:w="80" w:type="dxa"/>
+              <w:left w:w="100" w:type="dxa"/>
+              <w:right w:w="100" w:type="dxa"/>
+            </w:tcMar>
+          </w:tcPr>
+          <w:p>
+            <w:r>
+              <w:rPr>
+                <w:sz w:val="19"/>
+              </w:rPr>
+              <w:t>Pemindaian diagnostik real-time bentrok guru, kelas, dan kepatuhan izin.</w:t>
+            </w:r>
+          </w:p>
+        </w:tc>
+      </w:tr>
+      <w:tr>
+        <w:tc>
+          <w:tcPr>
+            <w:tcW w:type="dxa" w:w="4680"/>
+            <w:tcMar>
+              <w:top w:w="80" w:type="dxa"/>
+              <w:bottom w:w="80" w:type="dxa"/>
+              <w:left w:w="100" w:type="dxa"/>
+              <w:right w:w="100" w:type="dxa"/>
+            </w:tcMar>
+          </w:tcPr>
+          <w:p>
+            <w:r>
+              <w:rPr>
+                <w:b/>
+                <w:sz w:val="19"/>
+              </w:rPr>
+              <w:t>BAB 12: PANDUAN TEKNIS &amp; TROUBLESHOOTING ADMINISTRATOR</w:t>
             </w:r>
           </w:p>
         </w:tc>
@@ -600,6 +641,47 @@
                 <w:sz w:val="19"/>
               </w:rPr>
               <w:t>Tips pemeliharaan database, ganti tahun ajaran, dan solusi kendala.</w:t>
+            </w:r>
+          </w:p>
+        </w:tc>
+      </w:tr>
+      <w:tr>
+        <w:tc>
+          <w:tcPr>
+            <w:tcW w:type="dxa" w:w="4680"/>
+            <w:tcMar>
+              <w:top w:w="80" w:type="dxa"/>
+              <w:bottom w:w="80" w:type="dxa"/>
+              <w:left w:w="100" w:type="dxa"/>
+              <w:right w:w="100" w:type="dxa"/>
+            </w:tcMar>
+          </w:tcPr>
+          <w:p>
+            <w:r>
+              <w:rPr>
+                <w:b/>
+                <w:sz w:val="19"/>
+              </w:rPr>
+              <w:t>BAB 13: PENGUJIAN OTOMATIS &amp; KEPATUHAN AUDITOR CISA</w:t>
+            </w:r>
+          </w:p>
+        </w:tc>
+        <w:tc>
+          <w:tcPr>
+            <w:tcW w:type="dxa" w:w="4680"/>
+            <w:tcMar>
+              <w:top w:w="80" w:type="dxa"/>
+              <w:bottom w:w="80" w:type="dxa"/>
+              <w:left w:w="100" w:type="dxa"/>
+              <w:right w:w="100" w:type="dxa"/>
+            </w:tcMar>
+          </w:tcPr>
+          <w:p>
+            <w:r>
+              <w:rPr>
+                <w:sz w:val="19"/>
+              </w:rPr>
+              <w:t>Pengujian 8 kontrol audit standar ISACA ITAF dan ISO/IEC 25010 (100% PASS).</w:t>
             </w:r>
           </w:p>
         </w:tc>
@@ -1689,6 +1771,209 @@
     </w:tbl>
     <w:p>
       <w:pPr>
+        <w:pStyle w:val="Heading2"/>
+        <w:spacing w:before="240" w:after="80"/>
+      </w:pPr>
+      <w:r>
+        <w:rPr>
+          <w:rFonts w:ascii="Arial" w:hAnsi="Arial"/>
+          <w:b/>
+          <w:color w:val="10B981"/>
+          <w:sz w:val="24"/>
+        </w:rPr>
+        <w:t>5.2 Studi Kasus &amp; Alur Kerja: Guru Khusus Hari Tertentu &amp; Kelas Tertentu</w:t>
+      </w:r>
+    </w:p>
+    <w:p>
+      <w:r>
+        <w:t>Bagaimana jika ada guru yang memiliki permintaan khusus, misalnya: 'Hanya bisa mengajar di hari Sabtu saja dan hanya pada 3 rombel kelas tertentu'? Sistem mengakomodasi skenario ini secara persisten melalui kolaborasi 2 modul utama:</w:t>
+      </w:r>
+    </w:p>
+    <w:tbl>
+      <w:tblPr>
+        <w:tblW w:type="auto" w:w="0"/>
+        <w:jc w:val="center"/>
+        <w:tblLook w:firstColumn="1" w:firstRow="1" w:lastColumn="0" w:lastRow="0" w:noHBand="0" w:noVBand="1" w:val="04A0"/>
+      </w:tblPr>
+      <w:tblGrid>
+        <w:gridCol w:w="3120"/>
+        <w:gridCol w:w="3120"/>
+        <w:gridCol w:w="3120"/>
+      </w:tblGrid>
+      <w:tr>
+        <w:tc>
+          <w:tcPr>
+            <w:tcW w:type="dxa" w:w="3120"/>
+            <w:shd w:fill="10B981"/>
+          </w:tcPr>
+          <w:p>
+            <w:r>
+              <w:rPr>
+                <w:b/>
+                <w:color w:val="FFFFFF"/>
+              </w:rPr>
+              <w:t>Modul Terkait</w:t>
+            </w:r>
+          </w:p>
+        </w:tc>
+        <w:tc>
+          <w:tcPr>
+            <w:tcW w:type="dxa" w:w="3120"/>
+            <w:shd w:fill="10B981"/>
+          </w:tcPr>
+          <w:p>
+            <w:r>
+              <w:rPr>
+                <w:b/>
+                <w:color w:val="FFFFFF"/>
+              </w:rPr>
+              <w:t>Konfigurasi yang Dilakukan</w:t>
+            </w:r>
+          </w:p>
+        </w:tc>
+        <w:tc>
+          <w:tcPr>
+            <w:tcW w:type="dxa" w:w="3120"/>
+            <w:shd w:fill="10B981"/>
+          </w:tcPr>
+          <w:p>
+            <w:r>
+              <w:rPr>
+                <w:b/>
+                <w:color w:val="FFFFFF"/>
+              </w:rPr>
+              <w:t>Jaminan Sistem (Output)</w:t>
+            </w:r>
+          </w:p>
+        </w:tc>
+      </w:tr>
+      <w:tr>
+        <w:tc>
+          <w:tcPr>
+            <w:tcW w:type="dxa" w:w="3120"/>
+            <w:tcMar>
+              <w:top w:w="80" w:type="dxa"/>
+              <w:bottom w:w="80" w:type="dxa"/>
+              <w:left w:w="100" w:type="dxa"/>
+              <w:right w:w="100" w:type="dxa"/>
+            </w:tcMar>
+          </w:tcPr>
+          <w:p>
+            <w:r>
+              <w:rPr>
+                <w:b/>
+              </w:rPr>
+              <w:t>1. Modul Kertas Kerja</w:t>
+              <w:br/>
+              <w:t>(/master/teaching-load)</w:t>
+            </w:r>
+          </w:p>
+        </w:tc>
+        <w:tc>
+          <w:tcPr>
+            <w:tcW w:type="dxa" w:w="3120"/>
+            <w:tcMar>
+              <w:top w:w="80" w:type="dxa"/>
+              <w:bottom w:w="80" w:type="dxa"/>
+              <w:left w:w="100" w:type="dxa"/>
+              <w:right w:w="100" w:type="dxa"/>
+            </w:tcMar>
+          </w:tcPr>
+          <w:p>
+            <w:r>
+              <w:t>Daftarkan penugasan guru tersebut HANYA pada 3 kelas yang ditentukan (misal: VII-A, VII-B, VII-C @2 jam).</w:t>
+            </w:r>
+          </w:p>
+        </w:tc>
+        <w:tc>
+          <w:tcPr>
+            <w:tcW w:type="dxa" w:w="3120"/>
+            <w:tcMar>
+              <w:top w:w="80" w:type="dxa"/>
+              <w:bottom w:w="80" w:type="dxa"/>
+              <w:left w:w="100" w:type="dxa"/>
+              <w:right w:w="100" w:type="dxa"/>
+            </w:tcMar>
+          </w:tcPr>
+          <w:p>
+            <w:r>
+              <w:t>Guru TIDAK AKAN PERNAH dijadwalkan di kelas lain selain 3 kelas pilihan ini.</w:t>
+            </w:r>
+          </w:p>
+        </w:tc>
+      </w:tr>
+      <w:tr>
+        <w:tc>
+          <w:tcPr>
+            <w:tcW w:type="dxa" w:w="3120"/>
+            <w:tcMar>
+              <w:top w:w="80" w:type="dxa"/>
+              <w:bottom w:w="80" w:type="dxa"/>
+              <w:left w:w="100" w:type="dxa"/>
+              <w:right w:w="100" w:type="dxa"/>
+            </w:tcMar>
+          </w:tcPr>
+          <w:p>
+            <w:r>
+              <w:rPr>
+                <w:b/>
+              </w:rPr>
+              <w:t>2. Modul Izin Guru</w:t>
+              <w:br/>
+              <w:t>(/master/teachers -&gt; Constraint)</w:t>
+            </w:r>
+          </w:p>
+        </w:tc>
+        <w:tc>
+          <w:tcPr>
+            <w:tcW w:type="dxa" w:w="3120"/>
+            <w:tcMar>
+              <w:top w:w="80" w:type="dxa"/>
+              <w:bottom w:w="80" w:type="dxa"/>
+              <w:left w:w="100" w:type="dxa"/>
+              <w:right w:w="100" w:type="dxa"/>
+            </w:tcMar>
+          </w:tcPr>
+          <w:p>
+            <w:r>
+              <w:t>Kunci/blokir hari Senin s.d. Jumat (Warna MERAH [X]). Biarkan hari Sabtu KOSONG (Warna HIJAU [✓]).</w:t>
+            </w:r>
+          </w:p>
+        </w:tc>
+        <w:tc>
+          <w:tcPr>
+            <w:tcW w:type="dxa" w:w="3120"/>
+            <w:tcMar>
+              <w:top w:w="80" w:type="dxa"/>
+              <w:bottom w:w="80" w:type="dxa"/>
+              <w:left w:w="100" w:type="dxa"/>
+              <w:right w:w="100" w:type="dxa"/>
+            </w:tcMar>
+          </w:tcPr>
+          <w:p>
+            <w:r>
+              <w:t>Algoritma secara matematis TERKUNCI hanya menempatkan jam mengajar guru di hari Sabtu.</w:t>
+            </w:r>
+          </w:p>
+        </w:tc>
+      </w:tr>
+    </w:tbl>
+    <w:p>
+      <w:pPr>
+        <w:spacing w:before="160"/>
+      </w:pPr>
+      <w:r>
+        <w:rPr>
+          <w:b/>
+        </w:rPr>
+        <w:t xml:space="preserve">Hasil Eksekusi Auto-Generator: </w:t>
+      </w:r>
+      <w:r>
+        <w:t>Ketika tombol 'Mulai Auto-Generate' ditekan, sistem otomatis menempatkan seluruh 6 jam mengajar guru tersebut secara persisten hanya pada hari Sabtu, terbagi rapi pada 3 kelas target (misal: VII-A jam 1-2, VII-B jam 3-4, VII-C jam 5-6) dengan 0 bentrok!</w:t>
+      </w:r>
+    </w:p>
+    <w:p>
+      <w:pPr>
         <w:pStyle w:val="Heading1"/>
         <w:spacing w:before="320" w:after="160"/>
       </w:pPr>
@@ -2402,7 +2687,114 @@
           <w:color w:val="0F172A"/>
           <w:sz w:val="28"/>
         </w:rPr>
-        <w:t>BAB 11: PANDUAN TEKNIS &amp; TROUBLESHOOTING ADMINISTRATOR</w:t>
+        <w:t>BAB 11: PUSAT DETEKSI BENTROK (CONFLICT CENTER)</w:t>
+      </w:r>
+    </w:p>
+    <w:p>
+      <w:r>
+        <w:t>Pusat Deteksi Bentrok (`/master/conflicts`) berfungsi sebagai modul Quality Control &amp; Pre-Flight Check sebelum jadwal resmi dicetak dan disahkan oleh pimpinan. Sistem secara instan memindai 3 potensi pelanggaran:</w:t>
+      </w:r>
+    </w:p>
+    <w:p>
+      <w:pPr>
+        <w:pStyle w:val="ListBullet"/>
+        <w:spacing w:after="60"/>
+      </w:pPr>
+      <w:r>
+        <w:rPr>
+          <w:b/>
+        </w:rPr>
+        <w:t xml:space="preserve">Multi-Booking Guru: </w:t>
+      </w:r>
+      <w:r>
+        <w:t>Mendeteksi jika seorang guru terjadwal di 2 kelas berbeda pada hari dan jam yang sama.</w:t>
+      </w:r>
+    </w:p>
+    <w:p>
+      <w:pPr>
+        <w:pStyle w:val="ListBullet"/>
+        <w:spacing w:after="60"/>
+      </w:pPr>
+      <w:r>
+        <w:rPr>
+          <w:b/>
+        </w:rPr>
+        <w:t xml:space="preserve">Tabrakan Kelas: </w:t>
+      </w:r>
+      <w:r>
+        <w:t>Mendeteksi jika satu rombel kelas memiliki 2 mata pelajaran di jam yang sama.</w:t>
+      </w:r>
+    </w:p>
+    <w:p>
+      <w:pPr>
+        <w:pStyle w:val="ListBullet"/>
+        <w:spacing w:after="60"/>
+      </w:pPr>
+      <w:r>
+        <w:rPr>
+          <w:b/>
+        </w:rPr>
+        <w:t xml:space="preserve">Pelanggaran Izin Guru: </w:t>
+      </w:r>
+      <w:r>
+        <w:t>Mendeteksi jika ada jadwal yang melanggar permohonan libur/izin guru.</w:t>
+      </w:r>
+    </w:p>
+    <w:tbl>
+      <w:tblPr>
+        <w:tblW w:type="auto" w:w="0"/>
+        <w:jc w:val="center"/>
+        <w:tblLook w:firstColumn="1" w:firstRow="1" w:lastColumn="0" w:lastRow="0" w:noHBand="0" w:noVBand="1" w:val="04A0"/>
+      </w:tblPr>
+      <w:tblGrid>
+        <w:gridCol w:w="9360"/>
+      </w:tblGrid>
+      <w:tr>
+        <w:tc>
+          <w:tcPr>
+            <w:tcW w:type="dxa" w:w="9360"/>
+            <w:shd w:fill="ECFDF5"/>
+            <w:tcMar>
+              <w:top w:w="120" w:type="dxa"/>
+              <w:bottom w:w="120" w:type="dxa"/>
+              <w:left w:w="180" w:type="dxa"/>
+              <w:right w:w="180" w:type="dxa"/>
+            </w:tcMar>
+          </w:tcPr>
+          <w:p>
+            <w:pPr>
+              <w:spacing w:before="40" w:after="40"/>
+            </w:pPr>
+            <w:r>
+              <w:rPr>
+                <w:b/>
+                <w:sz w:val="19"/>
+              </w:rPr>
+              <w:t xml:space="preserve">✅ REKOMENDASI: </w:t>
+            </w:r>
+            <w:r>
+              <w:rPr>
+                <w:sz w:val="19"/>
+              </w:rPr>
+              <w:t>Jika seluruh jadwal bersih, halaman ini menampilkan lencana hijau 'Zero Conflict • 100% Bersih', menandakan jadwal siap dicetak ke format PDF resmi.</w:t>
+            </w:r>
+          </w:p>
+        </w:tc>
+      </w:tr>
+    </w:tbl>
+    <w:p>
+      <w:pPr>
+        <w:pStyle w:val="Heading1"/>
+        <w:spacing w:before="320" w:after="160"/>
+      </w:pPr>
+      <w:r>
+        <w:rPr>
+          <w:rFonts w:ascii="Arial" w:hAnsi="Arial"/>
+          <w:b/>
+          <w:color w:val="0F172A"/>
+          <w:sz w:val="28"/>
+        </w:rPr>
+        <w:t>BAB 12: PANDUAN TEKNIS &amp; TROUBLESHOOTING ADMINISTRATOR</w:t>
       </w:r>
     </w:p>
     <w:p>
@@ -2509,7 +2901,7 @@
           <w:color w:val="0F172A"/>
           <w:sz w:val="28"/>
         </w:rPr>
-        <w:t>BAB 12: PENGUJIAN OTOMATIS &amp; KEPATUHAN STANDAR AUDITOR CISA</w:t>
+        <w:t>BAB 13: PENGUJIAN OTOMATIS &amp; KEPATUHAN STANDAR AUDITOR CISA</w:t>
       </w:r>
     </w:p>
     <w:p>
@@ -2529,7 +2921,7 @@
           <w:color w:val="10B981"/>
           <w:sz w:val="24"/>
         </w:rPr>
-        <w:t>12.1 Kontrol Audit yang Diverifikasi (100% PASS):</w:t>
+        <w:t>13.1 Kontrol Audit yang Diverifikasi (100% PASS):</w:t>
       </w:r>
     </w:p>
     <w:p>

</xml_diff>